<commit_message>
讲义 WARN 数学记号清理：bare_subscript 27→0 + standard_state_circ 51→0 + degree_symbol 4→0 + teacher_facing_blockquote 1→0（10份源稿 kb_edit 按行唯一编辑）；重出 docx 4份 0 error
</commit_message>
<xml_diff>
--- a/00-首页/学生讲义Word/氢与卤素-超级充实版（自学完整）.docx
+++ b/00-首页/学生讲义Word/氢与卤素-超级充实版（自学完整）.docx
@@ -19245,13 +19245,39 @@
         </w:rPr>
         <w:t xml:space="preserve"> </w:t>
       </w:r>
+      <m:oMath>
+        <m:sSub>
+          <m:e>
+            <m:r>
+              <m:rPr>
+                <m:sty m:val="p"/>
+              </m:rPr>
+              <m:t>S</m:t>
+            </m:r>
+          </m:e>
+          <m:sub>
+            <m:r>
+              <m:rPr>
+                <m:sty m:val="p"/>
+              </m:rPr>
+              <m:t>N</m:t>
+            </m:r>
+          </m:sub>
+        </m:sSub>
+        <m:r>
+          <m:rPr>
+            <m:sty m:val="p"/>
+          </m:rPr>
+          <m:t>2</m:t>
+        </m:r>
+      </m:oMath>
       <w:r>
         <w:rPr>
           <w:rFonts w:ascii="Times New Roman" w:hAnsi="Times New Roman" w:eastAsia="Times New Roman" w:cs="Times New Roman"/>
           <w:b/>
           <w:bCs/>
         </w:rPr>
-        <w:t xml:space="preserve">S_N2 </w:t>
+        <w:t xml:space="preserve"> </w:t>
       </w:r>
       <w:r>
         <w:rPr>
@@ -19593,7 +19619,39 @@
         <w:rPr>
           <w:rFonts w:ascii="Times New Roman" w:hAnsi="Times New Roman" w:eastAsia="Times New Roman" w:cs="Times New Roman"/>
         </w:rPr>
-        <w:t xml:space="preserve"> S_N2 </w:t>
+        <w:t xml:space="preserve"> </w:t>
+      </w:r>
+      <m:oMath>
+        <m:sSub>
+          <m:e>
+            <m:r>
+              <m:rPr>
+                <m:sty m:val="p"/>
+              </m:rPr>
+              <m:t>S</m:t>
+            </m:r>
+          </m:e>
+          <m:sub>
+            <m:r>
+              <m:rPr>
+                <m:sty m:val="p"/>
+              </m:rPr>
+              <m:t>N</m:t>
+            </m:r>
+          </m:sub>
+        </m:sSub>
+        <m:r>
+          <m:rPr>
+            <m:sty m:val="p"/>
+          </m:rPr>
+          <m:t>2</m:t>
+        </m:r>
+      </m:oMath>
+      <w:r>
+        <w:rPr>
+          <w:rFonts w:ascii="Times New Roman" w:hAnsi="Times New Roman" w:eastAsia="Times New Roman" w:cs="Times New Roman"/>
+        </w:rPr>
+        <w:t xml:space="preserve"> </w:t>
       </w:r>
       <w:r>
         <w:rPr>

</xml_diff>